<commit_message>
Update manuscript and supplementary materials
</commit_message>
<xml_diff>
--- a/core subject/tables/paper_main/main_tables_for_manuscript.docx
+++ b/core subject/tables/paper_main/main_tables_for_manuscript.docx
@@ -1691,6 +1691,391 @@
       </w:tr>
     </w:tbl>
     <w:p/>
+    <w:p>
+      <w:r>
+        <w:rPr>
+          <w:sz w:val="18"/>
+        </w:rPr>
+        <w:t>Table 4. Input-set comparison for ternary spiked-soil concentration grading.</w:t>
+      </w:r>
+    </w:p>
+    <w:tbl>
+      <w:tblPr>
+        <w:tblStyle w:val="TableGrid"/>
+        <w:tblW w:type="auto" w:w="0"/>
+        <w:tblLook w:firstColumn="1" w:firstRow="1" w:lastColumn="0" w:lastRow="0" w:noHBand="0" w:noVBand="1" w:val="04A0"/>
+      </w:tblPr>
+      <w:tblGrid>
+        <w:gridCol w:w="1234"/>
+        <w:gridCol w:w="1234"/>
+        <w:gridCol w:w="1234"/>
+        <w:gridCol w:w="1234"/>
+        <w:gridCol w:w="1234"/>
+        <w:gridCol w:w="1234"/>
+        <w:gridCol w:w="1234"/>
+      </w:tblGrid>
+      <w:tr>
+        <w:tc>
+          <w:tcPr>
+            <w:tcW w:type="dxa" w:w="1234"/>
+          </w:tcPr>
+          <w:p>
+            <w:r>
+              <w:t>Input set</w:t>
+            </w:r>
+          </w:p>
+        </w:tc>
+        <w:tc>
+          <w:tcPr>
+            <w:tcW w:type="dxa" w:w="1234"/>
+          </w:tcPr>
+          <w:p>
+            <w:r>
+              <w:t>Features</w:t>
+            </w:r>
+          </w:p>
+        </w:tc>
+        <w:tc>
+          <w:tcPr>
+            <w:tcW w:type="dxa" w:w="1234"/>
+          </w:tcPr>
+          <w:p>
+            <w:r>
+              <w:t>Macro-F1</w:t>
+            </w:r>
+          </w:p>
+        </w:tc>
+        <w:tc>
+          <w:tcPr>
+            <w:tcW w:type="dxa" w:w="1234"/>
+          </w:tcPr>
+          <w:p>
+            <w:r>
+              <w:t>Balanced accuracy</w:t>
+            </w:r>
+          </w:p>
+        </w:tc>
+        <w:tc>
+          <w:tcPr>
+            <w:tcW w:type="dxa" w:w="1234"/>
+          </w:tcPr>
+          <w:p>
+            <w:r>
+              <w:t>Accuracy</w:t>
+            </w:r>
+          </w:p>
+        </w:tc>
+        <w:tc>
+          <w:tcPr>
+            <w:tcW w:type="dxa" w:w="1234"/>
+          </w:tcPr>
+          <w:p>
+            <w:r>
+              <w:t>OOF Macro-F1</w:t>
+            </w:r>
+          </w:p>
+        </w:tc>
+        <w:tc>
+          <w:tcPr>
+            <w:tcW w:type="dxa" w:w="1234"/>
+          </w:tcPr>
+          <w:p>
+            <w:r>
+              <w:t>Permutation p</w:t>
+            </w:r>
+          </w:p>
+        </w:tc>
+      </w:tr>
+      <w:tr>
+        <w:tc>
+          <w:tcPr>
+            <w:tcW w:type="dxa" w:w="1234"/>
+          </w:tcPr>
+          <w:p>
+            <w:r>
+              <w:t>MG 1616 cm^-1 single-band window</w:t>
+            </w:r>
+          </w:p>
+        </w:tc>
+        <w:tc>
+          <w:tcPr>
+            <w:tcW w:type="dxa" w:w="1234"/>
+          </w:tcPr>
+          <w:p>
+            <w:r>
+              <w:t>1</w:t>
+            </w:r>
+          </w:p>
+        </w:tc>
+        <w:tc>
+          <w:tcPr>
+            <w:tcW w:type="dxa" w:w="1234"/>
+          </w:tcPr>
+          <w:p>
+            <w:r>
+              <w:t>0.369 +/- 0.148</w:t>
+            </w:r>
+          </w:p>
+        </w:tc>
+        <w:tc>
+          <w:tcPr>
+            <w:tcW w:type="dxa" w:w="1234"/>
+          </w:tcPr>
+          <w:p>
+            <w:r>
+              <w:t>0.418 +/- 0.163</w:t>
+            </w:r>
+          </w:p>
+        </w:tc>
+        <w:tc>
+          <w:tcPr>
+            <w:tcW w:type="dxa" w:w="1234"/>
+          </w:tcPr>
+          <w:p>
+            <w:r>
+              <w:t>0.376 +/- 0.120</w:t>
+            </w:r>
+          </w:p>
+        </w:tc>
+        <w:tc>
+          <w:tcPr>
+            <w:tcW w:type="dxa" w:w="1234"/>
+          </w:tcPr>
+          <w:p>
+            <w:r>
+              <w:t>0.403</w:t>
+            </w:r>
+          </w:p>
+        </w:tc>
+        <w:tc>
+          <w:tcPr>
+            <w:tcW w:type="dxa" w:w="1234"/>
+          </w:tcPr>
+          <w:p>
+            <w:r>
+              <w:t>0.130</w:t>
+            </w:r>
+          </w:p>
+        </w:tc>
+      </w:tr>
+      <w:tr>
+        <w:tc>
+          <w:tcPr>
+            <w:tcW w:type="dxa" w:w="1234"/>
+          </w:tcPr>
+          <w:p>
+            <w:r>
+              <w:t>Manual marker-band windows</w:t>
+            </w:r>
+          </w:p>
+        </w:tc>
+        <w:tc>
+          <w:tcPr>
+            <w:tcW w:type="dxa" w:w="1234"/>
+          </w:tcPr>
+          <w:p>
+            <w:r>
+              <w:t>16</w:t>
+            </w:r>
+          </w:p>
+        </w:tc>
+        <w:tc>
+          <w:tcPr>
+            <w:tcW w:type="dxa" w:w="1234"/>
+          </w:tcPr>
+          <w:p>
+            <w:r>
+              <w:t>0.855 +/- 0.093</w:t>
+            </w:r>
+          </w:p>
+        </w:tc>
+        <w:tc>
+          <w:tcPr>
+            <w:tcW w:type="dxa" w:w="1234"/>
+          </w:tcPr>
+          <w:p>
+            <w:r>
+              <w:t>0.890 +/- 0.057</w:t>
+            </w:r>
+          </w:p>
+        </w:tc>
+        <w:tc>
+          <w:tcPr>
+            <w:tcW w:type="dxa" w:w="1234"/>
+          </w:tcPr>
+          <w:p>
+            <w:r>
+              <w:t>0.858 +/- 0.080</w:t>
+            </w:r>
+          </w:p>
+        </w:tc>
+        <w:tc>
+          <w:tcPr>
+            <w:tcW w:type="dxa" w:w="1234"/>
+          </w:tcPr>
+          <w:p>
+            <w:r>
+              <w:t>0.848</w:t>
+            </w:r>
+          </w:p>
+        </w:tc>
+        <w:tc>
+          <w:tcPr>
+            <w:tcW w:type="dxa" w:w="1234"/>
+          </w:tcPr>
+          <w:p>
+            <w:r>
+              <w:t>&lt;1.0e-4</w:t>
+            </w:r>
+          </w:p>
+        </w:tc>
+      </w:tr>
+      <w:tr>
+        <w:tc>
+          <w:tcPr>
+            <w:tcW w:type="dxa" w:w="1234"/>
+          </w:tcPr>
+          <w:p>
+            <w:r>
+              <w:t>SHAP top 10% wavenumbers</w:t>
+            </w:r>
+          </w:p>
+        </w:tc>
+        <w:tc>
+          <w:tcPr>
+            <w:tcW w:type="dxa" w:w="1234"/>
+          </w:tcPr>
+          <w:p>
+            <w:r>
+              <w:t>141</w:t>
+            </w:r>
+          </w:p>
+        </w:tc>
+        <w:tc>
+          <w:tcPr>
+            <w:tcW w:type="dxa" w:w="1234"/>
+          </w:tcPr>
+          <w:p>
+            <w:r>
+              <w:t>0.900 +/- 0.109</w:t>
+            </w:r>
+          </w:p>
+        </w:tc>
+        <w:tc>
+          <w:tcPr>
+            <w:tcW w:type="dxa" w:w="1234"/>
+          </w:tcPr>
+          <w:p>
+            <w:r>
+              <w:t>0.913 +/- 0.099</w:t>
+            </w:r>
+          </w:p>
+        </w:tc>
+        <w:tc>
+          <w:tcPr>
+            <w:tcW w:type="dxa" w:w="1234"/>
+          </w:tcPr>
+          <w:p>
+            <w:r>
+              <w:t>0.909 +/- 0.091</w:t>
+            </w:r>
+          </w:p>
+        </w:tc>
+        <w:tc>
+          <w:tcPr>
+            <w:tcW w:type="dxa" w:w="1234"/>
+          </w:tcPr>
+          <w:p>
+            <w:r>
+              <w:t>0.900</w:t>
+            </w:r>
+          </w:p>
+        </w:tc>
+        <w:tc>
+          <w:tcPr>
+            <w:tcW w:type="dxa" w:w="1234"/>
+          </w:tcPr>
+          <w:p>
+            <w:r>
+              <w:t>&lt;1.0e-4</w:t>
+            </w:r>
+          </w:p>
+        </w:tc>
+      </w:tr>
+      <w:tr>
+        <w:tc>
+          <w:tcPr>
+            <w:tcW w:type="dxa" w:w="1234"/>
+          </w:tcPr>
+          <w:p>
+            <w:r>
+              <w:t>Full p1 spectrum</w:t>
+            </w:r>
+          </w:p>
+        </w:tc>
+        <w:tc>
+          <w:tcPr>
+            <w:tcW w:type="dxa" w:w="1234"/>
+          </w:tcPr>
+          <w:p>
+            <w:r>
+              <w:t>1401</w:t>
+            </w:r>
+          </w:p>
+        </w:tc>
+        <w:tc>
+          <w:tcPr>
+            <w:tcW w:type="dxa" w:w="1234"/>
+          </w:tcPr>
+          <w:p>
+            <w:r>
+              <w:t>0.931 +/- 0.080</w:t>
+            </w:r>
+          </w:p>
+        </w:tc>
+        <w:tc>
+          <w:tcPr>
+            <w:tcW w:type="dxa" w:w="1234"/>
+          </w:tcPr>
+          <w:p>
+            <w:r>
+              <w:t>0.947 +/- 0.056</w:t>
+            </w:r>
+          </w:p>
+        </w:tc>
+        <w:tc>
+          <w:tcPr>
+            <w:tcW w:type="dxa" w:w="1234"/>
+          </w:tcPr>
+          <w:p>
+            <w:r>
+              <w:t>0.927 +/- 0.076</w:t>
+            </w:r>
+          </w:p>
+        </w:tc>
+        <w:tc>
+          <w:tcPr>
+            <w:tcW w:type="dxa" w:w="1234"/>
+          </w:tcPr>
+          <w:p>
+            <w:r>
+              <w:t>0.927</w:t>
+            </w:r>
+          </w:p>
+        </w:tc>
+        <w:tc>
+          <w:tcPr>
+            <w:tcW w:type="dxa" w:w="1234"/>
+          </w:tcPr>
+          <w:p>
+            <w:r>
+              <w:t>&lt;1.0e-4</w:t>
+            </w:r>
+          </w:p>
+        </w:tc>
+      </w:tr>
+    </w:tbl>
+    <w:p/>
     <w:sectPr>
       <w:pgSz w:w="12240" w:h="15840"/>
       <w:pgMar w:top="1440" w:right="1800" w:bottom="1440" w:left="1800" w:header="720" w:footer="720" w:gutter="0"/>

</xml_diff>